<commit_message>
4.5: sin línea blanca en los rótulos y Actividades y Bibliografía en bloques aparte
Co-Authored-By: Claude Opus 5.5 <noreply@anthropic.com>
Claude-Session: https://claude.ai/code/session_01Li7yxA95TVg4oPXuqG5DZe
</commit_message>
<xml_diff>
--- a/rediseno_2026/4.5 Itinerarios formateados y corregidos/ADM-101 Administración General.docx
+++ b/rediseno_2026/4.5 Itinerarios formateados y corregidos/ADM-101 Administración General.docx
@@ -86,6 +86,12 @@
           <w:insideV w:val="single" w:sz="6" w:space="0" w:color="1F3864"/>
         </w:tblBorders>
         <w:tblLayout w:type="fixed"/>
+        <w:tblCellMar>
+          <w:top w:w="40" w:type="dxa"/>
+          <w:left w:w="90" w:type="dxa"/>
+          <w:bottom w:w="40" w:type="dxa"/>
+          <w:right w:w="90" w:type="dxa"/>
+        </w:tblCellMar>
         <w:tblLook w:firstColumn="1" w:firstRow="1" w:lastColumn="0" w:lastRow="0" w:noHBand="0" w:noVBand="1" w:val="04A0"/>
       </w:tblPr>
       <w:tblGrid>
@@ -402,6 +408,12 @@
           <w:insideV w:val="single" w:sz="6" w:space="0" w:color="1F3864"/>
         </w:tblBorders>
         <w:tblLayout w:type="fixed"/>
+        <w:tblCellMar>
+          <w:top w:w="40" w:type="dxa"/>
+          <w:left w:w="90" w:type="dxa"/>
+          <w:bottom w:w="40" w:type="dxa"/>
+          <w:right w:w="90" w:type="dxa"/>
+        </w:tblCellMar>
         <w:tblLook w:firstColumn="1" w:firstRow="1" w:lastColumn="0" w:lastRow="0" w:noHBand="0" w:noVBand="1" w:val="04A0"/>
       </w:tblPr>
       <w:tblGrid>
@@ -974,6 +986,12 @@
           <w:insideV w:val="single" w:sz="6" w:space="0" w:color="1F3864"/>
         </w:tblBorders>
         <w:tblLayout w:type="fixed"/>
+        <w:tblCellMar>
+          <w:top w:w="40" w:type="dxa"/>
+          <w:left w:w="90" w:type="dxa"/>
+          <w:bottom w:w="40" w:type="dxa"/>
+          <w:right w:w="90" w:type="dxa"/>
+        </w:tblCellMar>
         <w:tblLook w:firstColumn="1" w:firstRow="1" w:lastColumn="0" w:lastRow="0" w:noHBand="0" w:noVBand="1" w:val="04A0"/>
       </w:tblPr>
       <w:tblGrid>
@@ -1089,6 +1107,12 @@
           <w:insideV w:val="single" w:sz="6" w:space="0" w:color="1F3864"/>
         </w:tblBorders>
         <w:tblLayout w:type="fixed"/>
+        <w:tblCellMar>
+          <w:top w:w="40" w:type="dxa"/>
+          <w:left w:w="90" w:type="dxa"/>
+          <w:bottom w:w="40" w:type="dxa"/>
+          <w:right w:w="90" w:type="dxa"/>
+        </w:tblCellMar>
         <w:tblLook w:firstColumn="1" w:firstRow="1" w:lastColumn="0" w:lastRow="0" w:noHBand="0" w:noVBand="1" w:val="04A0"/>
       </w:tblPr>
       <w:tblGrid>
@@ -2508,6 +2532,12 @@
           <w:insideV w:val="single" w:sz="6" w:space="0" w:color="1F3864"/>
         </w:tblBorders>
         <w:tblLayout w:type="fixed"/>
+        <w:tblCellMar>
+          <w:top w:w="40" w:type="dxa"/>
+          <w:left w:w="90" w:type="dxa"/>
+          <w:bottom w:w="40" w:type="dxa"/>
+          <w:right w:w="90" w:type="dxa"/>
+        </w:tblCellMar>
         <w:tblLook w:firstColumn="1" w:firstRow="1" w:lastColumn="0" w:lastRow="0" w:noHBand="0" w:noVBand="1" w:val="04A0"/>
       </w:tblPr>
       <w:tblGrid>
@@ -3750,6 +3780,12 @@
           <w:insideV w:val="single" w:sz="6" w:space="0" w:color="1F3864"/>
         </w:tblBorders>
         <w:tblLayout w:type="fixed"/>
+        <w:tblCellMar>
+          <w:top w:w="40" w:type="dxa"/>
+          <w:left w:w="90" w:type="dxa"/>
+          <w:bottom w:w="40" w:type="dxa"/>
+          <w:right w:w="90" w:type="dxa"/>
+        </w:tblCellMar>
         <w:tblLook w:firstColumn="1" w:firstRow="1" w:lastColumn="0" w:lastRow="0" w:noHBand="0" w:noVBand="1" w:val="04A0"/>
       </w:tblPr>
       <w:tblGrid>
@@ -4487,6 +4523,12 @@
           <w:insideV w:val="single" w:sz="6" w:space="0" w:color="1F3864"/>
         </w:tblBorders>
         <w:tblLayout w:type="fixed"/>
+        <w:tblCellMar>
+          <w:top w:w="40" w:type="dxa"/>
+          <w:left w:w="90" w:type="dxa"/>
+          <w:bottom w:w="40" w:type="dxa"/>
+          <w:right w:w="90" w:type="dxa"/>
+        </w:tblCellMar>
         <w:tblLook w:firstColumn="1" w:firstRow="1" w:lastColumn="0" w:lastRow="0" w:noHBand="0" w:noVBand="1" w:val="04A0"/>
       </w:tblPr>
       <w:tblGrid>
@@ -4997,6 +5039,12 @@
           <w:insideV w:val="single" w:sz="6" w:space="0" w:color="1F3864"/>
         </w:tblBorders>
         <w:tblLayout w:type="fixed"/>
+        <w:tblCellMar>
+          <w:top w:w="40" w:type="dxa"/>
+          <w:left w:w="90" w:type="dxa"/>
+          <w:bottom w:w="40" w:type="dxa"/>
+          <w:right w:w="90" w:type="dxa"/>
+        </w:tblCellMar>
         <w:tblLook w:firstColumn="1" w:firstRow="1" w:lastColumn="0" w:lastRow="0" w:noHBand="0" w:noVBand="1" w:val="04A0"/>
       </w:tblPr>
       <w:tblGrid>
@@ -6263,6 +6311,12 @@
           <w:insideV w:val="single" w:sz="6" w:space="0" w:color="1F3864"/>
         </w:tblBorders>
         <w:tblLayout w:type="fixed"/>
+        <w:tblCellMar>
+          <w:top w:w="40" w:type="dxa"/>
+          <w:left w:w="90" w:type="dxa"/>
+          <w:bottom w:w="40" w:type="dxa"/>
+          <w:right w:w="90" w:type="dxa"/>
+        </w:tblCellMar>
         <w:tblLook w:firstColumn="1" w:firstRow="1" w:lastColumn="0" w:lastRow="0" w:noHBand="0" w:noVBand="1" w:val="04A0"/>
       </w:tblPr>
       <w:tblGrid>
@@ -7471,6 +7525,12 @@
           <w:insideV w:val="single" w:sz="6" w:space="0" w:color="1F3864"/>
         </w:tblBorders>
         <w:tblLayout w:type="fixed"/>
+        <w:tblCellMar>
+          <w:top w:w="40" w:type="dxa"/>
+          <w:left w:w="90" w:type="dxa"/>
+          <w:bottom w:w="40" w:type="dxa"/>
+          <w:right w:w="90" w:type="dxa"/>
+        </w:tblCellMar>
         <w:tblLook w:firstColumn="1" w:firstRow="1" w:lastColumn="0" w:lastRow="0" w:noHBand="0" w:noVBand="1" w:val="04A0"/>
       </w:tblPr>
       <w:tblGrid>
@@ -7640,6 +7700,15 @@
         </w:tc>
       </w:tr>
     </w:tbl>
+    <w:p>
+      <w:pPr>
+        <w:spacing w:before="0" w:after="0" w:line="240" w:lineRule="auto"/>
+        <w:rPr>
+          <w:sz w:val="18"/>
+          <w:szCs w:val="18"/>
+        </w:rPr>
+      </w:pPr>
+    </w:p>
     <w:tbl>
       <w:tblPr>
         <w:tblW w:type="dxa" w:w="9405"/>
@@ -7653,6 +7722,12 @@
           <w:insideV w:val="single" w:sz="6" w:space="0" w:color="1F3864"/>
         </w:tblBorders>
         <w:tblLayout w:type="fixed"/>
+        <w:tblCellMar>
+          <w:top w:w="40" w:type="dxa"/>
+          <w:left w:w="90" w:type="dxa"/>
+          <w:bottom w:w="40" w:type="dxa"/>
+          <w:right w:w="90" w:type="dxa"/>
+        </w:tblCellMar>
         <w:tblLook w:firstColumn="1" w:firstRow="1" w:lastColumn="0" w:lastRow="0" w:noHBand="0" w:noVBand="1" w:val="04A0"/>
       </w:tblPr>
       <w:tblGrid>
@@ -9120,6 +9195,15 @@
         </w:tc>
       </w:tr>
     </w:tbl>
+    <w:p>
+      <w:pPr>
+        <w:spacing w:before="0" w:after="0" w:line="240" w:lineRule="auto"/>
+        <w:rPr>
+          <w:sz w:val="18"/>
+          <w:szCs w:val="18"/>
+        </w:rPr>
+      </w:pPr>
+    </w:p>
     <w:tbl>
       <w:tblPr>
         <w:tblW w:type="dxa" w:w="9405"/>
@@ -9133,6 +9217,12 @@
           <w:insideV w:val="single" w:sz="6" w:space="0" w:color="1F3864"/>
         </w:tblBorders>
         <w:tblLayout w:type="fixed"/>
+        <w:tblCellMar>
+          <w:top w:w="40" w:type="dxa"/>
+          <w:left w:w="90" w:type="dxa"/>
+          <w:bottom w:w="40" w:type="dxa"/>
+          <w:right w:w="90" w:type="dxa"/>
+        </w:tblCellMar>
         <w:tblLook w:firstColumn="1" w:firstRow="1" w:lastColumn="0" w:lastRow="0" w:noHBand="0" w:noVBand="1" w:val="04A0"/>
       </w:tblPr>
       <w:tblGrid>
@@ -9758,6 +9848,12 @@
           <w:insideV w:val="single" w:sz="6" w:space="0" w:color="1F3864"/>
         </w:tblBorders>
         <w:tblLayout w:type="fixed"/>
+        <w:tblCellMar>
+          <w:top w:w="40" w:type="dxa"/>
+          <w:left w:w="90" w:type="dxa"/>
+          <w:bottom w:w="40" w:type="dxa"/>
+          <w:right w:w="90" w:type="dxa"/>
+        </w:tblCellMar>
         <w:tblLook w:firstColumn="1" w:firstRow="1" w:lastColumn="0" w:lastRow="0" w:noHBand="0" w:noVBand="1" w:val="04A0"/>
       </w:tblPr>
       <w:tblGrid>
@@ -10087,6 +10183,12 @@
           <w:insideV w:val="single" w:sz="6" w:space="0" w:color="1F3864"/>
         </w:tblBorders>
         <w:tblLayout w:type="fixed"/>
+        <w:tblCellMar>
+          <w:top w:w="40" w:type="dxa"/>
+          <w:left w:w="90" w:type="dxa"/>
+          <w:bottom w:w="40" w:type="dxa"/>
+          <w:right w:w="90" w:type="dxa"/>
+        </w:tblCellMar>
         <w:tblLook w:firstColumn="1" w:firstRow="1" w:lastColumn="0" w:lastRow="0" w:noHBand="0" w:noVBand="1" w:val="04A0"/>
       </w:tblPr>
       <w:tblGrid>
@@ -12071,6 +12173,12 @@
           <w:insideV w:val="single" w:sz="6" w:space="0" w:color="1F3864"/>
         </w:tblBorders>
         <w:tblLayout w:type="fixed"/>
+        <w:tblCellMar>
+          <w:top w:w="40" w:type="dxa"/>
+          <w:left w:w="90" w:type="dxa"/>
+          <w:bottom w:w="40" w:type="dxa"/>
+          <w:right w:w="90" w:type="dxa"/>
+        </w:tblCellMar>
         <w:tblLook w:firstColumn="1" w:firstRow="1" w:lastColumn="0" w:lastRow="0" w:noHBand="0" w:noVBand="1" w:val="04A0"/>
       </w:tblPr>
       <w:tblGrid>
@@ -14930,6 +15038,12 @@
           <w:insideV w:val="single" w:sz="6" w:space="0" w:color="1F3864"/>
         </w:tblBorders>
         <w:tblLayout w:type="fixed"/>
+        <w:tblCellMar>
+          <w:top w:w="40" w:type="dxa"/>
+          <w:left w:w="90" w:type="dxa"/>
+          <w:bottom w:w="40" w:type="dxa"/>
+          <w:right w:w="90" w:type="dxa"/>
+        </w:tblCellMar>
         <w:tblLook w:firstColumn="1" w:firstRow="1" w:lastColumn="0" w:lastRow="0" w:noHBand="0" w:noVBand="1" w:val="04A0"/>
       </w:tblPr>
       <w:tblGrid>
@@ -17823,6 +17937,15 @@
         </w:tc>
       </w:tr>
     </w:tbl>
+    <w:p>
+      <w:pPr>
+        <w:spacing w:before="0" w:after="0" w:line="240" w:lineRule="auto"/>
+        <w:rPr>
+          <w:sz w:val="18"/>
+          <w:szCs w:val="18"/>
+        </w:rPr>
+      </w:pPr>
+    </w:p>
     <w:tbl>
       <w:tblPr>
         <w:tblW w:type="dxa" w:w="9405"/>
@@ -17836,6 +17959,12 @@
           <w:insideV w:val="single" w:sz="6" w:space="0" w:color="1F3864"/>
         </w:tblBorders>
         <w:tblLayout w:type="fixed"/>
+        <w:tblCellMar>
+          <w:top w:w="40" w:type="dxa"/>
+          <w:left w:w="90" w:type="dxa"/>
+          <w:bottom w:w="40" w:type="dxa"/>
+          <w:right w:w="90" w:type="dxa"/>
+        </w:tblCellMar>
         <w:tblLook w:firstColumn="1" w:firstRow="1" w:lastColumn="0" w:lastRow="0" w:noHBand="0" w:noVBand="1" w:val="04A0"/>
       </w:tblPr>
       <w:tblGrid>
@@ -17909,6 +18038,12 @@
           <w:insideV w:val="single" w:sz="6" w:space="0" w:color="1F3864"/>
         </w:tblBorders>
         <w:tblLayout w:type="fixed"/>
+        <w:tblCellMar>
+          <w:top w:w="40" w:type="dxa"/>
+          <w:left w:w="90" w:type="dxa"/>
+          <w:bottom w:w="40" w:type="dxa"/>
+          <w:right w:w="90" w:type="dxa"/>
+        </w:tblCellMar>
         <w:tblLook w:firstColumn="1" w:firstRow="1" w:lastColumn="0" w:lastRow="0" w:noHBand="0" w:noVBand="1" w:val="04A0"/>
       </w:tblPr>
       <w:tblGrid>

</xml_diff>